<commit_message>
fix(flows): preserve DOCX content and validate template bindings
Carry selected control metadata into Builder proposal prompts and enforce scalar bindings before publish. Keep shared templates neutral and reject unsupported list structures explicitly.
</commit_message>
<xml_diff>
--- a/backend/src/eneo/flows/runtime/templates/standard/dokument.docx
+++ b/backend/src/eneo/flows/runtime/templates/standard/dokument.docx
@@ -21,8 +21,7 @@
       </w:sdtContent>
     </w:sdt>
     <w:sectPr>
-      <w:headerReference w:type="default" r:id="rId9"/>
-      <w:footerReference w:type="default" r:id="rId10"/>
+      <w:footerReference w:type="default" r:id="rId9"/>
       <w:pgSz w:w="12240" w:h="15840"/>
       <w:pgMar w:top="1417" w:right="1417" w:bottom="1417" w:left="1417" w:header="720" w:footer="720" w:gutter="0"/>
       <w:cols w:space="720"/>
@@ -38,9 +37,6 @@
     <w:pPr>
       <w:pStyle w:val="Footer"/>
     </w:pPr>
-    <w:r>
-      <w:t xml:space="preserve">Sundsvalls kommun · Sida </w:t>
-    </w:r>
     <w:fldSimple w:instr="PAGE">
       <w:r>
         <w:t>1</w:t>
@@ -48,50 +44,6 @@
     </w:fldSimple>
   </w:p>
 </w:ftr>
-</file>
-
-<file path=word/header1.xml><?xml version="1.0" encoding="utf-8"?>
-<w:hdr xmlns:m="http://schemas.openxmlformats.org/officeDocument/2006/math" xmlns:mc="http://schemas.openxmlformats.org/markup-compatibility/2006" xmlns:mo="http://schemas.microsoft.com/office/mac/office/2008/main" xmlns:mv="urn:schemas-microsoft-com:mac:vml" xmlns:o="urn:schemas-microsoft-com:office:office" xmlns:r="http://schemas.openxmlformats.org/officeDocument/2006/relationships" xmlns:v="urn:schemas-microsoft-com:vml" xmlns:w10="urn:schemas-microsoft-com:office:word" xmlns:w14="http://schemas.microsoft.com/office/word/2010/wordml" xmlns:w="http://schemas.openxmlformats.org/wordprocessingml/2006/main" xmlns:wne="http://schemas.microsoft.com/office/word/2006/wordml" xmlns:wp14="http://schemas.microsoft.com/office/word/2010/wordprocessingDrawing" xmlns:wp="http://schemas.openxmlformats.org/drawingml/2006/wordprocessingDrawing" xmlns:wpc="http://schemas.microsoft.com/office/word/2010/wordprocessingCanvas" xmlns:wpg="http://schemas.microsoft.com/office/word/2010/wordprocessingGroup" xmlns:wpi="http://schemas.microsoft.com/office/word/2010/wordprocessingInk" xmlns:wps="http://schemas.microsoft.com/office/word/2010/wordprocessingShape" mc:Ignorable="w14 wp14">
-  <w:p>
-    <w:pPr>
-      <w:pStyle w:val="Header"/>
-    </w:pPr>
-    <w:r>
-      <w:drawing>
-        <wp:inline xmlns:a="http://schemas.openxmlformats.org/drawingml/2006/main" xmlns:pic="http://schemas.openxmlformats.org/drawingml/2006/picture">
-          <wp:extent cx="1440000" cy="360000"/>
-          <wp:docPr id="1" name="Picture 1" descr="Sundsvalls kommun logotyp" title="Logotyp"/>
-          <wp:cNvGraphicFramePr>
-            <a:graphicFrameLocks noChangeAspect="1"/>
-          </wp:cNvGraphicFramePr>
-          <a:graphic>
-            <a:graphicData uri="http://schemas.openxmlformats.org/drawingml/2006/picture">
-              <pic:pic>
-                <pic:nvPicPr>
-                  <pic:cNvPr id="0" name="image.png"/>
-                  <pic:cNvPicPr/>
-                </pic:nvPicPr>
-                <pic:blipFill>
-                  <a:blip r:embed="rId1"/>
-                  <a:stretch>
-                    <a:fillRect/>
-                  </a:stretch>
-                </pic:blipFill>
-                <pic:spPr>
-                  <a:xfrm>
-                    <a:off x="0" y="0"/>
-                    <a:ext cx="1440000" cy="360000"/>
-                  </a:xfrm>
-                  <a:prstGeom prst="rect"/>
-                </pic:spPr>
-              </pic:pic>
-            </a:graphicData>
-          </a:graphic>
-        </wp:inline>
-      </w:drawing>
-    </w:r>
-  </w:p>
-</w:hdr>
 </file>
 
 <file path=word/numbering.xml><?xml version="1.0" encoding="utf-8"?>

</xml_diff>